<commit_message>
Mitigate RISK-22: sliding eject lever (Option A) for zone module extraction
NP-TOOL-ZM-001:
- F-08 updated from pull tab to sliding eject lever: 10–12 mm arm,
  3:1 mechanical advantage, ≤1 N extraction force at lever tip
- Recessed flush when closed; snap-fit detent (0.3–0.5 N release)
  prevents accidental ejection during wear
- Hinge pin boss moulded into body; 316SS hinge pin press-fit
- OI-7 added: ME to confirm ≥2 mm clearance between lever pivot
  boss and ZIF back-flip lever in CAD + on prototype
- MDR checklist item 8 updated to reference lever clearance check

NP-FAI-ZM-001:
- FAI-A15 added: HFE lever accessibility test — 5 subjects with
  Parkinson's (H&Y II–III) or post-stroke weakness; ≤10 s extraction,
  ≤2 attempts, no accidental ejection during wear simulation
- §9 cross-reference RISK-22 row added

Risk register: RISK-22 → MITIGATED

https://claude.ai/code/session_017kypPzkHcL3KhUoMjKMy9S
</commit_message>
<xml_diff>
--- a/docs/neuropulse_fai_zone_module.docx
+++ b/docs/neuropulse_fai_zone_module.docx
@@ -6083,6 +6083,93 @@
           </w:p>
         </w:tc>
       </w:tr>
+      <w:tr>
+        <w:tc>
+          <w:tcPr>
+            <w:tcW w:w="936" w:type="dxa"/>
+            <w:shd w:val="clear" w:color="auto" w:fill="F5F5F5"/>
+          </w:tcPr>
+          <w:p>
+            <w:r>
+              <w:rPr>
+                <w:b/>
+                <w:sz w:val="16"/>
+              </w:rPr>
+              <w:t xml:space="preserve">FAI-A15</w:t>
+            </w:r>
+          </w:p>
+        </w:tc>
+        <w:tc>
+          <w:tcPr>
+            <w:tcW w:w="3311" w:type="dxa"/>
+            <w:shd w:val="clear" w:color="auto" w:fill="F5F5F5"/>
+          </w:tcPr>
+          <w:p>
+            <w:r>
+              <w:rPr>
+                <w:sz w:val="16"/>
+              </w:rPr>
+              <w:t xml:space="preserve">Eject lever accessibility test (RISK-22): 5 test subjects with diagnosed Parkinson's disease (Hoehn &amp; Yahr scale II–III) or post-stroke hand weakness (grip strength ≤ 8 kg). Each subject removes and reinserts all 5 zone modules twice (10 total operations). No coaching; standard user instructions only.</w:t>
+            </w:r>
+          </w:p>
+        </w:tc>
+        <w:tc>
+          <w:tcPr>
+            <w:tcW w:w="1728" w:type="dxa"/>
+            <w:shd w:val="clear" w:color="auto" w:fill="F5F5F5"/>
+          </w:tcPr>
+          <w:p>
+            <w:r>
+              <w:rPr>
+                <w:sz w:val="16"/>
+              </w:rPr>
+              <w:t xml:space="preserve">HFE formative test — 5 subjects with Parkinson's/post-stroke (pre-production)</w:t>
+            </w:r>
+          </w:p>
+        </w:tc>
+        <w:tc>
+          <w:tcPr>
+            <w:tcW w:w="2232" w:type="dxa"/>
+            <w:shd w:val="clear" w:color="auto" w:fill="F5F5F5"/>
+          </w:tcPr>
+          <w:p>
+            <w:r>
+              <w:rPr>
+                <w:sz w:val="16"/>
+              </w:rPr>
+              <w:t xml:space="preserve">All 5 subjects complete each extraction in ≤ 10 s with no more than 2 attempts. No reported pain or excessive effort. Lever detent must not prevent extraction. Lever must not accidentally eject during normal wear simulation (5 min handling without deliberate ejection attempt).</w:t>
+            </w:r>
+          </w:p>
+        </w:tc>
+        <w:tc>
+          <w:tcPr>
+            <w:tcW w:w="936" w:type="dxa"/>
+            <w:shd w:val="clear" w:color="auto" w:fill="F5F5F5"/>
+          </w:tcPr>
+          <w:p>
+            <w:r>
+              <w:rPr>
+                <w:sz w:val="16"/>
+              </w:rPr>
+              <w:t xml:space="preserve"/>
+            </w:r>
+          </w:p>
+        </w:tc>
+        <w:tc>
+          <w:tcPr>
+            <w:tcW w:w="648" w:type="dxa"/>
+            <w:shd w:val="clear" w:color="auto" w:fill="F5F5F5"/>
+          </w:tcPr>
+          <w:p>
+            <w:r>
+              <w:rPr>
+                <w:sz w:val="16"/>
+              </w:rPr>
+              <w:t xml:space="preserve"/>
+            </w:r>
+          </w:p>
+        </w:tc>
+      </w:tr>
     </w:tbl>
     <w:p/>
     <w:p>
@@ -10215,6 +10302,62 @@
                 <w:sz w:val="16"/>
               </w:rPr>
               <w:t xml:space="preserve">FAI-IPX-01, FAI-IPX-02, FAI-IPX-03, FAI-IPX-04</w:t>
+            </w:r>
+          </w:p>
+        </w:tc>
+        <w:tc>
+          <w:tcPr>
+            <w:tcW w:w="2592" w:type="dxa"/>
+            <w:shd w:val="clear" w:color="auto" w:fill="E2EFDA"/>
+          </w:tcPr>
+          <w:p>
+            <w:r>
+              <w:rPr>
+                <w:sz w:val="16"/>
+              </w:rPr>
+              <w:t xml:space="preserve">MITIGATED (this FAI)</w:t>
+            </w:r>
+          </w:p>
+        </w:tc>
+      </w:tr>
+      <w:tr>
+        <w:tc>
+          <w:tcPr>
+            <w:tcW w:w="936" w:type="dxa"/>
+          </w:tcPr>
+          <w:p>
+            <w:r>
+              <w:rPr>
+                <w:b/>
+                <w:sz w:val="16"/>
+              </w:rPr>
+              <w:t xml:space="preserve">RISK-22</w:t>
+            </w:r>
+          </w:p>
+        </w:tc>
+        <w:tc>
+          <w:tcPr>
+            <w:tcW w:w="2880" w:type="dxa"/>
+          </w:tcPr>
+          <w:p>
+            <w:r>
+              <w:rPr>
+                <w:sz w:val="16"/>
+              </w:rPr>
+              <w:t xml:space="preserve">Zone module extraction — reduced grip / tremor (sliding eject lever)</w:t>
+            </w:r>
+          </w:p>
+        </w:tc>
+        <w:tc>
+          <w:tcPr>
+            <w:tcW w:w="3384" w:type="dxa"/>
+          </w:tcPr>
+          <w:p>
+            <w:r>
+              <w:rPr>
+                <w:sz w:val="16"/>
+              </w:rPr>
+              <w:t xml:space="preserve">FAI-A15</w:t>
             </w:r>
           </w:p>
         </w:tc>

</xml_diff>